<commit_message>
docs: clarify personal coursework scope and finalize revised Word report
</commit_message>
<xml_diff>
--- a/submission/과제2_공시체크리스트_제출보고서.docx
+++ b/submission/과제2_공시체크리스트_제출보고서.docx
@@ -138,7 +138,7 @@
             <w:color w:val="000000"/>
             <w:u w:val="single"/>
           </w:rPr>
-          <w:t>https://dart-filing-readiness-keunil.tasty-note-8705.chatgpt.site</w:t>
+          <w:t>https://dart-filing-readiness-keunil.rmsdlf0330.chatgpt.site</w:t>
         </w:r>
       </w:hyperlink>
       <w:r>
@@ -6491,7 +6491,7 @@
         <w:rPr>
           <w:b w:val="0"/>
         </w:rPr>
-        <w:t>브라우저 실행 주체: Codex가 Edge 브라우저 자동화로 공개 앱의 체험·필터·다운로드·비우기·모바일을 확인했다. 작성자가 직접 조작한 결과로 기록하지 않는다. 이번 수정본의 공개 배포 확인은 검증 기록에 별도로 남긴다.</w:t>
+        <w:t>공개 배포: Sites 버전 3 배포 성공(2026-10-28 20:31 KST). Codex가 Edge 브라우저 자동화로 기능을 확인했다. 작성자가 직접 조작한 결과로 기록하지 않는다. 새 공개 주소는 표지와 마지막 장에 기재했다.</w:t>
       </w:r>
     </w:p>
     <w:p>
@@ -6687,7 +6687,7 @@
                   <w:color w:val="000000"/>
                   <w:u w:val="single"/>
                 </w:rPr>
-                <w:t>https://dart-filing-readiness-keunil.tasty-note-8705.chatgpt.site</w:t>
+                <w:t>https://dart-filing-readiness-keunil.rmsdlf0330.chatgpt.site</w:t>
               </w:r>
             </w:hyperlink>
           </w:p>

</xml_diff>

<commit_message>
docs: sync final submission with published version 4
</commit_message>
<xml_diff>
--- a/submission/과제2_공시체크리스트_제출보고서.docx
+++ b/submission/과제2_공시체크리스트_제출보고서.docx
@@ -2511,7 +2511,7 @@
         <w:rPr>
           <w:b w:val="0"/>
         </w:rPr>
-        <w:t>출처: 주차별 로컬 강의안. 상세 파일명·절·SHA-256은 docs/course-alignment.md에 기록했다. 기존 앱의 모든 설계가 처음부터 해당 강의에서 비롯되었다고 소급해 주장하지 않는다.</w:t>
+        <w:t>출처: 주차별 로컬 강의안. 상세 파일명·절·SHA-256은 docs/course-alignment.md에 기록했다. 강의안은 이번 보완 작업에서 앱 구조와 검증 기준을 설명하는 데 참고했다.</w:t>
       </w:r>
     </w:p>
     <w:p>
@@ -3301,7 +3301,7 @@
         <w:t>최종 결과·한계</w:t>
       </w:r>
       <w:r>
-        <w:t xml:space="preserve"> 기존 보호 동작을 보존하는 재사용 결정이다. 이번 과제에서 새로 발견해 원본 규칙을 전면 수정했다고 쓰지 않는다.</w:t>
+        <w:t xml:space="preserve"> 이번 과제에서는 이미 구현된 서식 구분과 보호 동작을 확인해 재사용했다.</w:t>
       </w:r>
     </w:p>
     <w:p>
@@ -6491,7 +6491,7 @@
         <w:rPr>
           <w:b w:val="0"/>
         </w:rPr>
-        <w:t>공개 배포: Sites 버전 3 배포 성공(2026-10-28 20:31 KST). Codex가 Edge 브라우저 자동화로 기능을 확인했다. 작성자가 직접 조작한 결과로 기록하지 않는다. 새 공개 주소는 표지와 마지막 장에 기재했다.</w:t>
+        <w:t>공개 배포: Sites 버전 4 공개 배포 완료(2026-10-28 20:39 KST). Codex가 Edge 브라우저 자동화로 기능을 확인했다. 작성자가 직접 조작한 결과로 기록하지 않는다. 새 공개 주소는 표지와 마지막 장에 기재했다.</w:t>
       </w:r>
     </w:p>
     <w:p>

</xml_diff>

<commit_message>
docs: correct final review grammar and flow label spacing
</commit_message>
<xml_diff>
--- a/submission/과제2_공시체크리스트_제출보고서.docx
+++ b/submission/과제2_공시체크리스트_제출보고서.docx
@@ -828,7 +828,7 @@
                 <w:b w:val="0"/>
                 <w:sz w:val="17"/>
               </w:rPr>
-              <w:t>자신의 파일을 선택하거나 가상 체험 자료을 실행해 문서 정보를 확인한다.</w:t>
+              <w:t>자신의 파일을 선택하거나 가상 체험 자료를 실행해 문서 정보를 확인한다.</w:t>
             </w:r>
           </w:p>
         </w:tc>
@@ -1014,7 +1014,7 @@
                 <w:b w:val="0"/>
                 <w:sz w:val="17"/>
               </w:rPr>
-              <w:t>오류·확인 필요·수동 확인·통과·해당 없음을 구분하고 필요한 항목을 찾는다.</w:t>
+              <w:t>오류 후보·확인 필요·수동 확인·통과·해당 없음을 구분하고 필요한 항목을 찾는다.</w:t>
             </w:r>
           </w:p>
         </w:tc>
@@ -1176,6 +1176,9 @@
         <w:t>01 · 시작</w:t>
       </w:r>
       <w:r>
+        <w:t xml:space="preserve">: </w:t>
+      </w:r>
+      <w:r>
         <w:t>가상 체험을 실행하거나 DSD 파일을 선택한다.</w:t>
       </w:r>
     </w:p>
@@ -1185,6 +1188,9 @@
           <w:b/>
         </w:rPr>
         <w:t>02 · 기준 확인</w:t>
+      </w:r>
+      <w:r>
+        <w:t xml:space="preserve">: </w:t>
       </w:r>
       <w:r>
         <w:t>해당 감사인의 프로필과 문서 종류를 확인한다.</w:t>
@@ -1198,6 +1204,9 @@
         <w:t>03 · 결과 검토</w:t>
       </w:r>
       <w:r>
+        <w:t xml:space="preserve">: </w:t>
+      </w:r>
+      <w:r>
         <w:t>상태별로 걸러 근거와 원문을 확인한다.</w:t>
       </w:r>
     </w:p>
@@ -1207,6 +1216,9 @@
           <w:b/>
         </w:rPr>
         <w:t>04 · 수동 확인</w:t>
+      </w:r>
+      <w:r>
+        <w:t xml:space="preserve">: </w:t>
       </w:r>
       <w:r>
         <w:t>사람의 판단이 필요한 항목을 검토한다.</w:t>
@@ -1220,6 +1232,9 @@
         <w:t>05 · 비교 체험</w:t>
       </w:r>
       <w:r>
+        <w:t xml:space="preserve">: </w:t>
+      </w:r>
+      <w:r>
         <w:t>오류·수정 샘플을 실행해 결과 차이를 본다.</w:t>
       </w:r>
     </w:p>
@@ -1229,6 +1244,9 @@
           <w:b/>
         </w:rPr>
         <w:t>06 · 결과 보관</w:t>
+      </w:r>
+      <w:r>
+        <w:t xml:space="preserve">: </w:t>
       </w:r>
       <w:r>
         <w:t>필요한 결과를 사용자 기기에 내려받는다.</w:t>
@@ -2635,7 +2653,7 @@
         <w:rPr>
           <w:b w:val="0"/>
         </w:rPr>
-        <w:t>그림 2. 로컬 수정본. 점검 결과. 오류·확인 필요·수동 확인 등의 상태를 구분하고 필요한 결과를 찾는다.</w:t>
+        <w:t>그림 2. 로컬 수정본. 점검 결과. 오류 후보·확인 필요·수동 확인 등의 상태를 구분하고 필요한 결과를 찾는다.</w:t>
       </w:r>
     </w:p>
     <w:p>
@@ -3830,6 +3848,9 @@
         <w:t>28 / 28건</w:t>
       </w:r>
       <w:r>
+        <w:t xml:space="preserve">: </w:t>
+      </w:r>
+      <w:r>
         <w:t>읽기·점검 완료</w:t>
       </w:r>
       <w:r>
@@ -3847,6 +3868,9 @@
         <w:t>23 + 5건</w:t>
       </w:r>
       <w:r>
+        <w:t xml:space="preserve">: </w:t>
+      </w:r>
+      <w:r>
         <w:t>감사보고서 00760</w:t>
       </w:r>
       <w:r>
@@ -3862,6 +3886,9 @@
           <w:b/>
         </w:rPr>
         <w:t>1,624항목</w:t>
+      </w:r>
+      <w:r>
+        <w:t xml:space="preserve">: </w:t>
       </w:r>
       <w:r>
         <w:t>28문서 × 58항목</w:t>

</xml_diff>